<commit_message>
feat: stream live defense AI answers and preserve loading states
</commit_message>
<xml_diff>
--- a/demo/artifacts/AdaptiveEdu答辩镜像操作手册.docx
+++ b/demo/artifacts/AdaptiveEdu答辩镜像操作手册.docx
@@ -612,6 +612,116 @@
       </w:r>
       <w:r>
         <w:t>。</w:t>
+      </w:r>
+    </w:p>
+    <w:p>
+      <w:pPr>
+        <w:pStyle w:val="Heading1"/>
+      </w:pPr>
+      <w:r>
+        <w:t>现场 AI 密钥</w:t>
+      </w:r>
+    </w:p>
+    <w:p>
+      <w:pPr/>
+      <w:r>
+        <w:t xml:space="preserve">有网络时，系统优先调用 DeepSeek V4.1 Flash。在演示电脑当前用户的 </w:t>
+      </w:r>
+      <w:r>
+        <w:rPr>
+          <w:rFonts w:ascii="Consolas" w:hAnsi="Consolas" w:eastAsia="Consolas" w:cs="Consolas"/>
+          <w:b w:val="0"/>
+          <w:color w:val="142232"/>
+          <w:sz w:val="18"/>
+        </w:rPr>
+        <w:t>%USERPROFILE%\.agents\secrets\adaptive-edu-deepseek.env</w:t>
+      </w:r>
+      <w:r>
+        <w:t xml:space="preserve"> 中配置 </w:t>
+      </w:r>
+      <w:r>
+        <w:rPr>
+          <w:rFonts w:ascii="Consolas" w:hAnsi="Consolas" w:eastAsia="Consolas" w:cs="Consolas"/>
+          <w:b w:val="0"/>
+          <w:color w:val="142232"/>
+          <w:sz w:val="18"/>
+        </w:rPr>
+        <w:t>DEMO_LLM_API_KEY</w:t>
+      </w:r>
+      <w:r>
+        <w:t xml:space="preserve"> 和 </w:t>
+      </w:r>
+      <w:r>
+        <w:rPr>
+          <w:rFonts w:ascii="Consolas" w:hAnsi="Consolas" w:eastAsia="Consolas" w:cs="Consolas"/>
+          <w:b w:val="0"/>
+          <w:color w:val="142232"/>
+          <w:sz w:val="18"/>
+        </w:rPr>
+        <w:t>DEMO_LLM_REQUEST_TIMEOUT</w:t>
+      </w:r>
+      <w:r>
+        <w:t xml:space="preserve">。密钥文件不随交付包、镜像或 Git 分发；换电脑须重新配置。启动和恢复脚本按 </w:t>
+      </w:r>
+      <w:r>
+        <w:rPr>
+          <w:rFonts w:ascii="Consolas" w:hAnsi="Consolas" w:eastAsia="Consolas" w:cs="Consolas"/>
+          <w:b w:val="0"/>
+          <w:color w:val="142232"/>
+          <w:sz w:val="18"/>
+        </w:rPr>
+        <w:t>-EnvFile</w:t>
+      </w:r>
+      <w:r>
+        <w:t>、</w:t>
+      </w:r>
+      <w:r>
+        <w:rPr>
+          <w:rFonts w:ascii="Consolas" w:hAnsi="Consolas" w:eastAsia="Consolas" w:cs="Consolas"/>
+          <w:b w:val="0"/>
+          <w:color w:val="142232"/>
+          <w:sz w:val="18"/>
+        </w:rPr>
+        <w:t>ADAPTIVE_EDU_DEMO_ENV_FILE</w:t>
+      </w:r>
+      <w:r>
+        <w:t xml:space="preserve">、同目录非空 </w:t>
+      </w:r>
+      <w:r>
+        <w:rPr>
+          <w:rFonts w:ascii="Consolas" w:hAnsi="Consolas" w:eastAsia="Consolas" w:cs="Consolas"/>
+          <w:b w:val="0"/>
+          <w:color w:val="142232"/>
+          <w:sz w:val="18"/>
+        </w:rPr>
+        <w:t>.env.local</w:t>
+      </w:r>
+      <w:r>
+        <w:t xml:space="preserve">、上述私有路径的顺序查找。脚本不打印密钥值；不要分享 </w:t>
+      </w:r>
+      <w:r>
+        <w:rPr>
+          <w:rFonts w:ascii="Consolas" w:hAnsi="Consolas" w:eastAsia="Consolas" w:cs="Consolas"/>
+          <w:b w:val="0"/>
+          <w:color w:val="142232"/>
+          <w:sz w:val="18"/>
+        </w:rPr>
+        <w:t>docker compose config</w:t>
+      </w:r>
+      <w:r>
+        <w:t xml:space="preserve"> 或 </w:t>
+      </w:r>
+      <w:r>
+        <w:rPr>
+          <w:rFonts w:ascii="Consolas" w:hAnsi="Consolas" w:eastAsia="Consolas" w:cs="Consolas"/>
+          <w:b w:val="0"/>
+          <w:color w:val="142232"/>
+          <w:sz w:val="18"/>
+        </w:rPr>
+        <w:t>docker inspect</w:t>
+      </w:r>
+      <w:r>
+        <w:t xml:space="preserve"> 输出。未配置密钥时，固定问题仍可使用镜像中的已核对回答。</w:t>
       </w:r>
     </w:p>
     <w:p>
@@ -1506,7 +1616,7 @@
     <w:p>
       <w:pPr/>
       <w:r>
-        <w:t xml:space="preserve">准备交付包时，项目内置 AI 已使用 DeepSeek V4.1 Flash 对固定的演示问题和学习流程做真实调用。官方 API 请求名为 </w:t>
+        <w:t xml:space="preserve">交付前已用 DeepSeek V4.1 Flash 真实调用固定问题和学习流程，接口模型名为 </w:t>
       </w:r>
       <w:r>
         <w:rPr>
@@ -1518,7 +1628,7 @@
         <w:t>deepseek-flash</w:t>
       </w:r>
       <w:r>
-        <w:t>。成功得到的回答按模型、调用类型和完整请求指纹保存；现场相同请求可直接使用经过核对的结果。回答文件不含 API key，也不保存原始提问全文。现场运行不依赖外部模型服务；输入与彩排不同的问题时，系统使用课程知识点和资源生成内容，因此答案可能与录屏不同。</w:t>
+        <w:t>。已核对的回答按模型、调用类型和请求指纹保存，文件不含 API key 或原始提问全文。有密钥且网络可用时，AI 助手先实时回答，页面显示生成状态并逐步出现正文，文字可能与录屏不同。实时请求不可用时，固定问题使用已核对的回答；其他问题依据课程知识点和资源生成内容。每次恢复后，脚本会从用户私有文件重新注入密钥。</w:t>
       </w:r>
     </w:p>
     <w:p>
@@ -1696,7 +1806,7 @@
         <w:t xml:space="preserve">•  </w:t>
       </w:r>
       <w:r>
-        <w:t xml:space="preserve">若浏览器显示旧页面，先刷新；仍不一致时核对 </w:t>
+        <w:t xml:space="preserve">若页面版本或学生起点不对，核对 </w:t>
       </w:r>
       <w:r>
         <w:rPr>
@@ -1708,47 +1818,13 @@
         <w:t>manifest.json</w:t>
       </w:r>
       <w:r>
-        <w:t xml:space="preserve"> 中的镜像 ID，重新执行恢复脚本。</w:t>
-      </w:r>
-    </w:p>
-    <w:p>
-      <w:pPr>
-        <w:ind w:left="397" w:hanging="227"/>
-      </w:pPr>
-      <w:r>
-        <w:rPr>
-          <w:rFonts w:ascii="Microsoft YaHei" w:hAnsi="Microsoft YaHei" w:eastAsia="Microsoft YaHei" w:cs="Microsoft YaHei"/>
-          <w:b w:val="0"/>
-          <w:color w:val="142232"/>
-          <w:sz w:val="21"/>
-        </w:rPr>
-        <w:t xml:space="preserve">•  </w:t>
-      </w:r>
-      <w:r>
-        <w:t>若学生页面不是预期起点，重新执行恢复脚本和验收脚本。</w:t>
-      </w:r>
-    </w:p>
-    <w:p>
-      <w:pPr>
-        <w:ind w:left="397" w:hanging="227"/>
-      </w:pPr>
-      <w:r>
-        <w:rPr>
-          <w:rFonts w:ascii="Microsoft YaHei" w:hAnsi="Microsoft YaHei" w:eastAsia="Microsoft YaHei" w:cs="Microsoft YaHei"/>
-          <w:b w:val="0"/>
-          <w:color w:val="142232"/>
-          <w:sz w:val="21"/>
-        </w:rPr>
-        <w:t xml:space="preserve">•  </w:t>
-      </w:r>
-      <w:r>
-        <w:t>不要把本机密钥文件、课程原始资料或演示端口发布到公网。</w:t>
+        <w:t xml:space="preserve"> 后重新恢复并验收；不要公开本机密钥、课程资料或演示端口。</w:t>
       </w:r>
     </w:p>
     <w:sectPr>
       <w:footerReference w:type="default" r:id="rId9"/>
       <w:pgSz w:w="12240" w:h="15840"/>
-      <w:pgMar w:top="1077" w:right="1191" w:bottom="1020" w:left="1191" w:header="720" w:footer="720" w:gutter="0"/>
+      <w:pgMar w:top="964" w:right="1191" w:bottom="907" w:left="1191" w:header="720" w:footer="720" w:gutter="0"/>
       <w:cols w:space="720"/>
       <w:docGrid w:linePitch="360"/>
     </w:sectPr>

</xml_diff>

<commit_message>
build: embed defense AI key in backend image
</commit_message>
<xml_diff>
--- a/demo/artifacts/AdaptiveEdu答辩镜像操作手册.docx
+++ b/demo/artifacts/AdaptiveEdu答辩镜像操作手册.docx
@@ -619,73 +619,13 @@
         <w:pStyle w:val="Heading1"/>
       </w:pPr>
       <w:r>
-        <w:t>现场 AI 密钥</w:t>
+        <w:t>镜像内置 AI 密钥</w:t>
       </w:r>
     </w:p>
     <w:p>
       <w:pPr/>
       <w:r>
-        <w:t xml:space="preserve">有网络时，系统优先调用 DeepSeek V4.1 Flash。在演示电脑当前用户的 </w:t>
-      </w:r>
-      <w:r>
-        <w:rPr>
-          <w:rFonts w:ascii="Consolas" w:hAnsi="Consolas" w:eastAsia="Consolas" w:cs="Consolas"/>
-          <w:b w:val="0"/>
-          <w:color w:val="142232"/>
-          <w:sz w:val="18"/>
-        </w:rPr>
-        <w:t>%USERPROFILE%\.agents\secrets\adaptive-edu-deepseek.env</w:t>
-      </w:r>
-      <w:r>
-        <w:t xml:space="preserve"> 中配置 </w:t>
-      </w:r>
-      <w:r>
-        <w:rPr>
-          <w:rFonts w:ascii="Consolas" w:hAnsi="Consolas" w:eastAsia="Consolas" w:cs="Consolas"/>
-          <w:b w:val="0"/>
-          <w:color w:val="142232"/>
-          <w:sz w:val="18"/>
-        </w:rPr>
-        <w:t>DEMO_LLM_API_KEY</w:t>
-      </w:r>
-      <w:r>
-        <w:t xml:space="preserve"> 和 </w:t>
-      </w:r>
-      <w:r>
-        <w:rPr>
-          <w:rFonts w:ascii="Consolas" w:hAnsi="Consolas" w:eastAsia="Consolas" w:cs="Consolas"/>
-          <w:b w:val="0"/>
-          <w:color w:val="142232"/>
-          <w:sz w:val="18"/>
-        </w:rPr>
-        <w:t>DEMO_LLM_REQUEST_TIMEOUT</w:t>
-      </w:r>
-      <w:r>
-        <w:t xml:space="preserve">。密钥文件不随交付包、镜像或 Git 分发；换电脑须重新配置。启动和恢复脚本按 </w:t>
-      </w:r>
-      <w:r>
-        <w:rPr>
-          <w:rFonts w:ascii="Consolas" w:hAnsi="Consolas" w:eastAsia="Consolas" w:cs="Consolas"/>
-          <w:b w:val="0"/>
-          <w:color w:val="142232"/>
-          <w:sz w:val="18"/>
-        </w:rPr>
-        <w:t>-EnvFile</w:t>
-      </w:r>
-      <w:r>
-        <w:t>、</w:t>
-      </w:r>
-      <w:r>
-        <w:rPr>
-          <w:rFonts w:ascii="Consolas" w:hAnsi="Consolas" w:eastAsia="Consolas" w:cs="Consolas"/>
-          <w:b w:val="0"/>
-          <w:color w:val="142232"/>
-          <w:sz w:val="18"/>
-        </w:rPr>
-        <w:t>ADAPTIVE_EDU_DEMO_ENV_FILE</w:t>
-      </w:r>
-      <w:r>
-        <w:t xml:space="preserve">、同目录非空 </w:t>
+        <w:t xml:space="preserve">后端镜像已经内置 DeepSeek V4.1 Flash 的 API 密钥。换电脑恢复镜像后，不需要另建 </w:t>
       </w:r>
       <w:r>
         <w:rPr>
@@ -697,7 +637,7 @@
         <w:t>.env.local</w:t>
       </w:r>
       <w:r>
-        <w:t xml:space="preserve">、上述私有路径的顺序查找。脚本不打印密钥值；不要分享 </w:t>
+        <w:t xml:space="preserve"> 或用户私有密钥文件；网络可用时，AI 助手会直接调用模型。Docker 镜像的环境变量可以被镜像持有者查看，因此只应把交付包发给获准参加答辩和维护系统的人员。若密钥撤销或轮换，需要用新密钥重新构建后端镜像和 </w:t>
       </w:r>
       <w:r>
         <w:rPr>
@@ -706,22 +646,10 @@
           <w:color w:val="142232"/>
           <w:sz w:val="18"/>
         </w:rPr>
-        <w:t>docker compose config</w:t>
+        <w:t>images.tar</w:t>
       </w:r>
       <w:r>
-        <w:t xml:space="preserve"> 或 </w:t>
-      </w:r>
-      <w:r>
-        <w:rPr>
-          <w:rFonts w:ascii="Consolas" w:hAnsi="Consolas" w:eastAsia="Consolas" w:cs="Consolas"/>
-          <w:b w:val="0"/>
-          <w:color w:val="142232"/>
-          <w:sz w:val="18"/>
-        </w:rPr>
-        <w:t>docker inspect</w:t>
-      </w:r>
-      <w:r>
-        <w:t xml:space="preserve"> 输出。未配置密钥时，固定问题仍可使用镜像中的已核对回答。</w:t>
+        <w:t>。</w:t>
       </w:r>
     </w:p>
     <w:p>
@@ -1628,7 +1556,7 @@
         <w:t>deepseek-flash</w:t>
       </w:r>
       <w:r>
-        <w:t>。已核对的回答按模型、调用类型和请求指纹保存，文件不含 API key 或原始提问全文。有密钥且网络可用时，AI 助手先实时回答，页面显示生成状态并逐步出现正文，文字可能与录屏不同。实时请求不可用时，固定问题使用已核对的回答；其他问题依据课程知识点和资源生成内容。每次恢复后，脚本会从用户私有文件重新注入密钥。</w:t>
+        <w:t>。网络可用时，AI 助手使用镜像内置密钥实时回答，页面显示生成状态并逐步出现正文，文字可能与录屏不同。已核对的回答按模型、调用类型和请求指纹保存，预置文件不含原始提问全文。实时请求不可用时，固定问题使用已核对的回答；其他问题依据课程知识点和资源生成内容。</w:t>
       </w:r>
     </w:p>
     <w:p>
@@ -1818,7 +1746,7 @@
         <w:t>manifest.json</w:t>
       </w:r>
       <w:r>
-        <w:t xml:space="preserve"> 后重新恢复并验收；不要公开本机密钥、课程资料或演示端口。</w:t>
+        <w:t xml:space="preserve"> 后重新恢复并验收；不要公开镜像、课程资料或演示端口。</w:t>
       </w:r>
     </w:p>
     <w:sectPr>

</xml_diff>

<commit_message>
ui: simplify learning and teaching interface text
</commit_message>
<xml_diff>
--- a/demo/artifacts/AdaptiveEdu答辩镜像操作手册.docx
+++ b/demo/artifacts/AdaptiveEdu答辩镜像操作手册.docx
@@ -13,7 +13,7 @@
     <w:p>
       <w:pPr/>
       <w:r>
-        <w:t>这份手册给现场演示者使用。交付包包含可离线载入的 Docker 镜像、数据库起点、课程文件、截图和讲解录屏。恢复脚本会把两名学生重新放回各自的起点：</w:t>
+        <w:t xml:space="preserve">交付包包含 Docker 镜像、大数据课程资料、四个账号和恢复数据。学生 </w:t>
       </w:r>
       <w:r>
         <w:rPr>
@@ -37,7 +37,7 @@
         <w:t>student2</w:t>
       </w:r>
       <w:r>
-        <w:t xml:space="preserve"> 只加入了“大数据技术与应用”课程，尚未完成初始测评。</w:t>
+        <w:t xml:space="preserve"> 处于加入课程后的未测评状态。</w:t>
       </w:r>
     </w:p>
     <w:p>
@@ -45,625 +45,13 @@
         <w:pStyle w:val="Heading1"/>
       </w:pPr>
       <w:r>
-        <w:t>交付包里有什么</w:t>
-      </w:r>
-    </w:p>
-    <w:tbl>
-      <w:tblPr>
-        <w:tblW w:type="auto" w:w="0"/>
-        <w:tblLayout w:type="fixed"/>
-        <w:tblLook w:firstColumn="1" w:firstRow="1" w:lastColumn="0" w:lastRow="0" w:noHBand="0" w:noVBand="1" w:val="04A0"/>
-        <w:tblBorders>
-          <w:top w:val="single" w:sz="5" w:color="D9D9D9"/>
-          <w:left w:val="single" w:sz="5" w:color="D9D9D9"/>
-          <w:bottom w:val="single" w:sz="5" w:color="D9D9D9"/>
-          <w:right w:val="single" w:sz="5" w:color="D9D9D9"/>
-          <w:insideH w:val="single" w:sz="5" w:color="D9D9D9"/>
-          <w:insideV w:val="single" w:sz="5" w:color="D9D9D9"/>
-        </w:tblBorders>
-      </w:tblPr>
-      <w:tblGrid>
-        <w:gridCol w:w="4929"/>
-        <w:gridCol w:w="4929"/>
-      </w:tblGrid>
-      <w:tr>
-        <w:trPr>
-          <w:cantSplit/>
-          <w:tblHeader w:val="true"/>
-        </w:trPr>
-        <w:tc>
-          <w:tcPr>
-            <w:tcW w:type="dxa" w:w="2721"/>
-            <w:vAlign w:val="center"/>
-            <w:tcMar>
-              <w:top w:w="95" w:type="dxa"/>
-              <w:start w:w="105" w:type="dxa"/>
-              <w:bottom w:w="95" w:type="dxa"/>
-              <w:end w:w="105" w:type="dxa"/>
-            </w:tcMar>
-            <w:shd w:fill="18324F"/>
-          </w:tcPr>
-          <w:p>
-            <w:pPr>
-              <w:spacing w:after="0" w:line="271" w:lineRule="auto"/>
-            </w:pPr>
-            <w:r>
-              <w:rPr>
-                <w:rFonts w:ascii="Microsoft YaHei" w:hAnsi="Microsoft YaHei" w:eastAsia="Microsoft YaHei" w:cs="Microsoft YaHei"/>
-                <w:b/>
-                <w:color w:val="FFFFFF"/>
-                <w:sz w:val="18"/>
-              </w:rPr>
-              <w:t>文件或目录</w:t>
-            </w:r>
-          </w:p>
-        </w:tc>
-        <w:tc>
-          <w:tcPr>
-            <w:tcW w:type="dxa" w:w="7087"/>
-            <w:vAlign w:val="center"/>
-            <w:tcMar>
-              <w:top w:w="95" w:type="dxa"/>
-              <w:start w:w="105" w:type="dxa"/>
-              <w:bottom w:w="95" w:type="dxa"/>
-              <w:end w:w="105" w:type="dxa"/>
-            </w:tcMar>
-            <w:shd w:fill="18324F"/>
-          </w:tcPr>
-          <w:p>
-            <w:pPr>
-              <w:spacing w:after="0" w:line="271" w:lineRule="auto"/>
-            </w:pPr>
-            <w:r>
-              <w:rPr>
-                <w:rFonts w:ascii="Microsoft YaHei" w:hAnsi="Microsoft YaHei" w:eastAsia="Microsoft YaHei" w:cs="Microsoft YaHei"/>
-                <w:b/>
-                <w:color w:val="FFFFFF"/>
-                <w:sz w:val="18"/>
-              </w:rPr>
-              <w:t>用途</w:t>
-            </w:r>
-          </w:p>
-        </w:tc>
-      </w:tr>
-      <w:tr>
-        <w:trPr>
-          <w:cantSplit/>
-        </w:trPr>
-        <w:tc>
-          <w:tcPr>
-            <w:tcW w:type="dxa" w:w="2721"/>
-            <w:vAlign w:val="center"/>
-            <w:tcMar>
-              <w:top w:w="95" w:type="dxa"/>
-              <w:start w:w="105" w:type="dxa"/>
-              <w:bottom w:w="95" w:type="dxa"/>
-              <w:end w:w="105" w:type="dxa"/>
-            </w:tcMar>
-          </w:tcPr>
-          <w:p>
-            <w:pPr>
-              <w:spacing w:after="0" w:line="278" w:lineRule="auto"/>
-            </w:pPr>
-            <w:r>
-              <w:rPr>
-                <w:rFonts w:ascii="Consolas" w:hAnsi="Consolas" w:eastAsia="Consolas" w:cs="Consolas"/>
-                <w:b w:val="0"/>
-                <w:color w:val="142232"/>
-                <w:sz w:val="18"/>
-              </w:rPr>
-              <w:t>images.tar</w:t>
-            </w:r>
-          </w:p>
-        </w:tc>
-        <w:tc>
-          <w:tcPr>
-            <w:tcW w:type="dxa" w:w="7087"/>
-            <w:vAlign w:val="center"/>
-            <w:tcMar>
-              <w:top w:w="95" w:type="dxa"/>
-              <w:start w:w="105" w:type="dxa"/>
-              <w:bottom w:w="95" w:type="dxa"/>
-              <w:end w:w="105" w:type="dxa"/>
-            </w:tcMar>
-          </w:tcPr>
-          <w:p>
-            <w:pPr>
-              <w:spacing w:after="0" w:line="278" w:lineRule="auto"/>
-            </w:pPr>
-            <w:r>
-              <w:rPr>
-                <w:rFonts w:ascii="Microsoft YaHei" w:hAnsi="Microsoft YaHei" w:eastAsia="Microsoft YaHei" w:cs="Microsoft YaHei"/>
-                <w:b w:val="0"/>
-                <w:color w:val="142232"/>
-                <w:sz w:val="18"/>
-              </w:rPr>
-              <w:t>一次载入前后端、PostgreSQL、Neo4j 和截图录屏工件镜像</w:t>
-            </w:r>
-          </w:p>
-        </w:tc>
-      </w:tr>
-      <w:tr>
-        <w:trPr>
-          <w:cantSplit/>
-        </w:trPr>
-        <w:tc>
-          <w:tcPr>
-            <w:tcW w:type="dxa" w:w="2721"/>
-            <w:vAlign w:val="center"/>
-            <w:tcMar>
-              <w:top w:w="95" w:type="dxa"/>
-              <w:start w:w="105" w:type="dxa"/>
-              <w:bottom w:w="95" w:type="dxa"/>
-              <w:end w:w="105" w:type="dxa"/>
-            </w:tcMar>
-            <w:shd w:fill="F3F7FB"/>
-          </w:tcPr>
-          <w:p>
-            <w:pPr>
-              <w:spacing w:after="0" w:line="278" w:lineRule="auto"/>
-            </w:pPr>
-            <w:r>
-              <w:rPr>
-                <w:rFonts w:ascii="Consolas" w:hAnsi="Consolas" w:eastAsia="Consolas" w:cs="Consolas"/>
-                <w:b w:val="0"/>
-                <w:color w:val="142232"/>
-                <w:sz w:val="18"/>
-              </w:rPr>
-              <w:t>postgres-baseline.dump</w:t>
-            </w:r>
-          </w:p>
-        </w:tc>
-        <w:tc>
-          <w:tcPr>
-            <w:tcW w:type="dxa" w:w="7087"/>
-            <w:vAlign w:val="center"/>
-            <w:tcMar>
-              <w:top w:w="95" w:type="dxa"/>
-              <w:start w:w="105" w:type="dxa"/>
-              <w:bottom w:w="95" w:type="dxa"/>
-              <w:end w:w="105" w:type="dxa"/>
-            </w:tcMar>
-            <w:shd w:fill="F3F7FB"/>
-          </w:tcPr>
-          <w:p>
-            <w:pPr>
-              <w:spacing w:after="0" w:line="278" w:lineRule="auto"/>
-            </w:pPr>
-            <w:r>
-              <w:rPr>
-                <w:rFonts w:ascii="Microsoft YaHei" w:hAnsi="Microsoft YaHei" w:eastAsia="Microsoft YaHei" w:cs="Microsoft YaHei"/>
-                <w:b w:val="0"/>
-                <w:color w:val="142232"/>
-                <w:sz w:val="18"/>
-              </w:rPr>
-              <w:t>四个账号和课程学习状态的数据库起点</w:t>
-            </w:r>
-          </w:p>
-        </w:tc>
-      </w:tr>
-      <w:tr>
-        <w:trPr>
-          <w:cantSplit/>
-        </w:trPr>
-        <w:tc>
-          <w:tcPr>
-            <w:tcW w:type="dxa" w:w="2721"/>
-            <w:vAlign w:val="center"/>
-            <w:tcMar>
-              <w:top w:w="95" w:type="dxa"/>
-              <w:start w:w="105" w:type="dxa"/>
-              <w:bottom w:w="95" w:type="dxa"/>
-              <w:end w:w="105" w:type="dxa"/>
-            </w:tcMar>
-          </w:tcPr>
-          <w:p>
-            <w:pPr>
-              <w:spacing w:after="0" w:line="278" w:lineRule="auto"/>
-            </w:pPr>
-            <w:r>
-              <w:rPr>
-                <w:rFonts w:ascii="Consolas" w:hAnsi="Consolas" w:eastAsia="Consolas" w:cs="Consolas"/>
-                <w:b w:val="0"/>
-                <w:color w:val="142232"/>
-                <w:sz w:val="18"/>
-              </w:rPr>
-              <w:t>media-rag-baseline.tar</w:t>
-            </w:r>
-          </w:p>
-        </w:tc>
-        <w:tc>
-          <w:tcPr>
-            <w:tcW w:type="dxa" w:w="7087"/>
-            <w:vAlign w:val="center"/>
-            <w:tcMar>
-              <w:top w:w="95" w:type="dxa"/>
-              <w:start w:w="105" w:type="dxa"/>
-              <w:bottom w:w="95" w:type="dxa"/>
-              <w:end w:w="105" w:type="dxa"/>
-            </w:tcMar>
-          </w:tcPr>
-          <w:p>
-            <w:pPr>
-              <w:spacing w:after="0" w:line="278" w:lineRule="auto"/>
-            </w:pPr>
-            <w:r>
-              <w:rPr>
-                <w:rFonts w:ascii="Microsoft YaHei" w:hAnsi="Microsoft YaHei" w:eastAsia="Microsoft YaHei" w:cs="Microsoft YaHei"/>
-                <w:b w:val="0"/>
-                <w:color w:val="142232"/>
-                <w:sz w:val="18"/>
-              </w:rPr>
-              <w:t>大数据课程文件与检索索引</w:t>
-            </w:r>
-          </w:p>
-        </w:tc>
-      </w:tr>
-      <w:tr>
-        <w:trPr>
-          <w:cantSplit/>
-        </w:trPr>
-        <w:tc>
-          <w:tcPr>
-            <w:tcW w:type="dxa" w:w="2721"/>
-            <w:vAlign w:val="center"/>
-            <w:tcMar>
-              <w:top w:w="95" w:type="dxa"/>
-              <w:start w:w="105" w:type="dxa"/>
-              <w:bottom w:w="95" w:type="dxa"/>
-              <w:end w:w="105" w:type="dxa"/>
-            </w:tcMar>
-            <w:shd w:fill="F3F7FB"/>
-          </w:tcPr>
-          <w:p>
-            <w:pPr>
-              <w:spacing w:after="0" w:line="278" w:lineRule="auto"/>
-            </w:pPr>
-            <w:r>
-              <w:rPr>
-                <w:rFonts w:ascii="Consolas" w:hAnsi="Consolas" w:eastAsia="Consolas" w:cs="Consolas"/>
-                <w:b w:val="0"/>
-                <w:color w:val="142232"/>
-                <w:sz w:val="18"/>
-              </w:rPr>
-              <w:t>manifest.json</w:t>
-            </w:r>
-          </w:p>
-        </w:tc>
-        <w:tc>
-          <w:tcPr>
-            <w:tcW w:type="dxa" w:w="7087"/>
-            <w:vAlign w:val="center"/>
-            <w:tcMar>
-              <w:top w:w="95" w:type="dxa"/>
-              <w:start w:w="105" w:type="dxa"/>
-              <w:bottom w:w="95" w:type="dxa"/>
-              <w:end w:w="105" w:type="dxa"/>
-            </w:tcMar>
-            <w:shd w:fill="F3F7FB"/>
-          </w:tcPr>
-          <w:p>
-            <w:pPr>
-              <w:spacing w:after="0" w:line="278" w:lineRule="auto"/>
-            </w:pPr>
-            <w:r>
-              <w:rPr>
-                <w:rFonts w:ascii="Microsoft YaHei" w:hAnsi="Microsoft YaHei" w:eastAsia="Microsoft YaHei" w:cs="Microsoft YaHei"/>
-                <w:b w:val="0"/>
-                <w:color w:val="142232"/>
-                <w:sz w:val="18"/>
-              </w:rPr>
-              <w:t>镜像 ID、归档大小和 SHA-256 校验值</w:t>
-            </w:r>
-          </w:p>
-        </w:tc>
-      </w:tr>
-      <w:tr>
-        <w:trPr>
-          <w:cantSplit/>
-        </w:trPr>
-        <w:tc>
-          <w:tcPr>
-            <w:tcW w:type="dxa" w:w="2721"/>
-            <w:vAlign w:val="center"/>
-            <w:tcMar>
-              <w:top w:w="95" w:type="dxa"/>
-              <w:start w:w="105" w:type="dxa"/>
-              <w:bottom w:w="95" w:type="dxa"/>
-              <w:end w:w="105" w:type="dxa"/>
-            </w:tcMar>
-          </w:tcPr>
-          <w:p>
-            <w:pPr>
-              <w:spacing w:after="0" w:line="278" w:lineRule="auto"/>
-            </w:pPr>
-            <w:r>
-              <w:rPr>
-                <w:rFonts w:ascii="Consolas" w:hAnsi="Consolas" w:eastAsia="Consolas" w:cs="Consolas"/>
-                <w:b w:val="0"/>
-                <w:color w:val="142232"/>
-                <w:sz w:val="18"/>
-              </w:rPr>
-              <w:t>demo/</w:t>
-            </w:r>
-          </w:p>
-        </w:tc>
-        <w:tc>
-          <w:tcPr>
-            <w:tcW w:type="dxa" w:w="7087"/>
-            <w:vAlign w:val="center"/>
-            <w:tcMar>
-              <w:top w:w="95" w:type="dxa"/>
-              <w:start w:w="105" w:type="dxa"/>
-              <w:bottom w:w="95" w:type="dxa"/>
-              <w:end w:w="105" w:type="dxa"/>
-            </w:tcMar>
-          </w:tcPr>
-          <w:p>
-            <w:pPr>
-              <w:spacing w:after="0" w:line="278" w:lineRule="auto"/>
-            </w:pPr>
-            <w:r>
-              <w:rPr>
-                <w:rFonts w:ascii="Microsoft YaHei" w:hAnsi="Microsoft YaHei" w:eastAsia="Microsoft YaHei" w:cs="Microsoft YaHei"/>
-                <w:b w:val="0"/>
-                <w:color w:val="142232"/>
-                <w:sz w:val="18"/>
-              </w:rPr>
-              <w:t>Compose 文件和启动、恢复、验收、工件提取脚本</w:t>
-            </w:r>
-          </w:p>
-        </w:tc>
-      </w:tr>
-      <w:tr>
-        <w:trPr>
-          <w:cantSplit/>
-        </w:trPr>
-        <w:tc>
-          <w:tcPr>
-            <w:tcW w:type="dxa" w:w="2721"/>
-            <w:vAlign w:val="center"/>
-            <w:tcMar>
-              <w:top w:w="95" w:type="dxa"/>
-              <w:start w:w="105" w:type="dxa"/>
-              <w:bottom w:w="95" w:type="dxa"/>
-              <w:end w:w="105" w:type="dxa"/>
-            </w:tcMar>
-            <w:shd w:fill="F3F7FB"/>
-          </w:tcPr>
-          <w:p>
-            <w:pPr>
-              <w:spacing w:after="0" w:line="278" w:lineRule="auto"/>
-            </w:pPr>
-            <w:r>
-              <w:rPr>
-                <w:rFonts w:ascii="Consolas" w:hAnsi="Consolas" w:eastAsia="Consolas" w:cs="Consolas"/>
-                <w:b w:val="0"/>
-                <w:color w:val="142232"/>
-                <w:sz w:val="18"/>
-              </w:rPr>
-              <w:t>screenshots/</w:t>
-            </w:r>
-          </w:p>
-        </w:tc>
-        <w:tc>
-          <w:tcPr>
-            <w:tcW w:type="dxa" w:w="7087"/>
-            <w:vAlign w:val="center"/>
-            <w:tcMar>
-              <w:top w:w="95" w:type="dxa"/>
-              <w:start w:w="105" w:type="dxa"/>
-              <w:bottom w:w="95" w:type="dxa"/>
-              <w:end w:w="105" w:type="dxa"/>
-            </w:tcMar>
-            <w:shd w:fill="F3F7FB"/>
-          </w:tcPr>
-          <w:p>
-            <w:pPr>
-              <w:spacing w:after="0" w:line="278" w:lineRule="auto"/>
-            </w:pPr>
-            <w:r>
-              <w:rPr>
-                <w:rFonts w:ascii="Microsoft YaHei" w:hAnsi="Microsoft YaHei" w:eastAsia="Microsoft YaHei" w:cs="Microsoft YaHei"/>
-                <w:b w:val="0"/>
-                <w:color w:val="142232"/>
-                <w:sz w:val="18"/>
-              </w:rPr>
-              <w:t>从最终应用代码逐步采集的页面截图</w:t>
-            </w:r>
-          </w:p>
-        </w:tc>
-      </w:tr>
-      <w:tr>
-        <w:trPr>
-          <w:cantSplit/>
-        </w:trPr>
-        <w:tc>
-          <w:tcPr>
-            <w:tcW w:type="dxa" w:w="2721"/>
-            <w:vAlign w:val="center"/>
-            <w:tcMar>
-              <w:top w:w="95" w:type="dxa"/>
-              <w:start w:w="105" w:type="dxa"/>
-              <w:bottom w:w="95" w:type="dxa"/>
-              <w:end w:w="105" w:type="dxa"/>
-            </w:tcMar>
-          </w:tcPr>
-          <w:p>
-            <w:pPr>
-              <w:spacing w:after="0" w:line="278" w:lineRule="auto"/>
-            </w:pPr>
-            <w:r>
-              <w:rPr>
-                <w:rFonts w:ascii="Consolas" w:hAnsi="Consolas" w:eastAsia="Consolas" w:cs="Consolas"/>
-                <w:b w:val="0"/>
-                <w:color w:val="142232"/>
-                <w:sz w:val="18"/>
-              </w:rPr>
-              <w:t>recordings/</w:t>
-            </w:r>
-          </w:p>
-        </w:tc>
-        <w:tc>
-          <w:tcPr>
-            <w:tcW w:type="dxa" w:w="7087"/>
-            <w:vAlign w:val="center"/>
-            <w:tcMar>
-              <w:top w:w="95" w:type="dxa"/>
-              <w:start w:w="105" w:type="dxa"/>
-              <w:bottom w:w="95" w:type="dxa"/>
-              <w:end w:w="105" w:type="dxa"/>
-            </w:tcMar>
-          </w:tcPr>
-          <w:p>
-            <w:pPr>
-              <w:spacing w:after="0" w:line="278" w:lineRule="auto"/>
-            </w:pPr>
-            <w:r>
-              <w:rPr>
-                <w:rFonts w:ascii="Microsoft YaHei" w:hAnsi="Microsoft YaHei" w:eastAsia="Microsoft YaHei" w:cs="Microsoft YaHei"/>
-                <w:b w:val="0"/>
-                <w:color w:val="142232"/>
-                <w:sz w:val="18"/>
-              </w:rPr>
-              <w:t>真实浏览器操作录屏和带讲解的成片</w:t>
-            </w:r>
-          </w:p>
-        </w:tc>
-      </w:tr>
-      <w:tr>
-        <w:trPr>
-          <w:cantSplit/>
-        </w:trPr>
-        <w:tc>
-          <w:tcPr>
-            <w:tcW w:type="dxa" w:w="2721"/>
-            <w:vAlign w:val="center"/>
-            <w:tcMar>
-              <w:top w:w="95" w:type="dxa"/>
-              <w:start w:w="105" w:type="dxa"/>
-              <w:bottom w:w="95" w:type="dxa"/>
-              <w:end w:w="105" w:type="dxa"/>
-            </w:tcMar>
-            <w:shd w:fill="F3F7FB"/>
-          </w:tcPr>
-          <w:p>
-            <w:pPr>
-              <w:spacing w:after="0" w:line="278" w:lineRule="auto"/>
-            </w:pPr>
-            <w:r>
-              <w:rPr>
-                <w:rFonts w:ascii="Consolas" w:hAnsi="Consolas" w:eastAsia="Consolas" w:cs="Consolas"/>
-                <w:b w:val="0"/>
-                <w:color w:val="142232"/>
-                <w:sz w:val="18"/>
-              </w:rPr>
-              <w:t>evidence/</w:t>
-            </w:r>
-          </w:p>
-        </w:tc>
-        <w:tc>
-          <w:tcPr>
-            <w:tcW w:type="dxa" w:w="7087"/>
-            <w:vAlign w:val="center"/>
-            <w:tcMar>
-              <w:top w:w="95" w:type="dxa"/>
-              <w:start w:w="105" w:type="dxa"/>
-              <w:bottom w:w="95" w:type="dxa"/>
-              <w:end w:w="105" w:type="dxa"/>
-            </w:tcMar>
-            <w:shd w:fill="F3F7FB"/>
-          </w:tcPr>
-          <w:p>
-            <w:pPr>
-              <w:spacing w:after="0" w:line="278" w:lineRule="auto"/>
-            </w:pPr>
-            <w:r>
-              <w:rPr>
-                <w:rFonts w:ascii="Microsoft YaHei" w:hAnsi="Microsoft YaHei" w:eastAsia="Microsoft YaHei" w:cs="Microsoft YaHei"/>
-                <w:b w:val="0"/>
-                <w:color w:val="142232"/>
-                <w:sz w:val="18"/>
-              </w:rPr>
-              <w:t>构建、测试、截图与录屏的版本和校验记录</w:t>
-            </w:r>
-          </w:p>
-        </w:tc>
-      </w:tr>
-    </w:tbl>
-    <w:p>
-      <w:pPr>
-        <w:spacing w:after="40"/>
-      </w:pPr>
-    </w:p>
-    <w:p>
-      <w:pPr/>
-      <w:r>
-        <w:t xml:space="preserve">课程内容来自仓库中的“大数据技术与应用”资料：知识图谱、初测题、作业题库、课件、视频和教材。交付包的应用只监听本机 </w:t>
-      </w:r>
-      <w:r>
-        <w:rPr>
-          <w:rFonts w:ascii="Consolas" w:hAnsi="Consolas" w:eastAsia="Consolas" w:cs="Consolas"/>
-          <w:b w:val="0"/>
-          <w:color w:val="142232"/>
-          <w:sz w:val="18"/>
-        </w:rPr>
-        <w:t>127.0.0.1:18080</w:t>
-      </w:r>
-      <w:r>
-        <w:t>。</w:t>
-      </w:r>
-    </w:p>
-    <w:p>
-      <w:pPr>
-        <w:pStyle w:val="Heading1"/>
-      </w:pPr>
-      <w:r>
-        <w:t>镜像内置 AI 密钥</w:t>
+        <w:t>启动与恢复</w:t>
       </w:r>
     </w:p>
     <w:p>
       <w:pPr/>
       <w:r>
-        <w:t xml:space="preserve">后端镜像已经内置 DeepSeek V4.1 Flash 的 API 密钥。换电脑恢复镜像后，不需要另建 </w:t>
-      </w:r>
-      <w:r>
-        <w:rPr>
-          <w:rFonts w:ascii="Consolas" w:hAnsi="Consolas" w:eastAsia="Consolas" w:cs="Consolas"/>
-          <w:b w:val="0"/>
-          <w:color w:val="142232"/>
-          <w:sz w:val="18"/>
-        </w:rPr>
-        <w:t>.env.local</w:t>
-      </w:r>
-      <w:r>
-        <w:t xml:space="preserve"> 或用户私有密钥文件；网络可用时，AI 助手会直接调用模型。Docker 镜像的环境变量可以被镜像持有者查看，因此只应把交付包发给获准参加答辩和维护系统的人员。若密钥撤销或轮换，需要用新密钥重新构建后端镜像和 </w:t>
-      </w:r>
-      <w:r>
-        <w:rPr>
-          <w:rFonts w:ascii="Consolas" w:hAnsi="Consolas" w:eastAsia="Consolas" w:cs="Consolas"/>
-          <w:b w:val="0"/>
-          <w:color w:val="142232"/>
-          <w:sz w:val="18"/>
-        </w:rPr>
-        <w:t>images.tar</w:t>
-      </w:r>
-      <w:r>
-        <w:t>。</w:t>
-      </w:r>
-    </w:p>
-    <w:p>
-      <w:pPr>
-        <w:pStyle w:val="Heading1"/>
-      </w:pPr>
-      <w:r>
-        <w:t>现场启动</w:t>
-      </w:r>
-    </w:p>
-    <w:p>
-      <w:pPr/>
-      <w:r>
-        <w:t>先启动 Docker Desktop 并确认 Linux 容器引擎可用。将交付目录完整复制到演示电脑，在 PowerShell 中进入该目录，执行：</w:t>
+        <w:t>启动 Docker Desktop，在交付目录打开 PowerShell，执行：</w:t>
       </w:r>
     </w:p>
     <w:p>
@@ -687,7 +75,19 @@
     <w:p>
       <w:pPr/>
       <w:r>
-        <w:t xml:space="preserve">恢复脚本先核对归档 SHA-256，再载入镜像、恢复演示项目自己的数据库和课程文件。它只重置 </w:t>
+        <w:t xml:space="preserve">打开 </w:t>
+      </w:r>
+      <w:r>
+        <w:rPr>
+          <w:rFonts w:ascii="Consolas" w:hAnsi="Consolas" w:eastAsia="Consolas" w:cs="Consolas"/>
+          <w:b w:val="0"/>
+          <w:color w:val="142232"/>
+          <w:sz w:val="18"/>
+        </w:rPr>
+        <w:t>http://127.0.0.1:18080</w:t>
+      </w:r>
+      <w:r>
+        <w:t xml:space="preserve">，浏览器使用 1920×1080。恢复脚本会重置 </w:t>
       </w:r>
       <w:r>
         <w:rPr>
@@ -699,19 +99,30 @@
         <w:t>adaptive-edu-defense-demo</w:t>
       </w:r>
       <w:r>
-        <w:t xml:space="preserve"> 这个 Compose 项目及其卷。脚本结束后，在浏览器打开 </w:t>
+        <w:t xml:space="preserve"> 项目的数据库和课程文件。</w:t>
       </w:r>
+    </w:p>
+    <w:p>
+      <w:pPr/>
       <w:r>
-        <w:rPr>
-          <w:rFonts w:ascii="Consolas" w:hAnsi="Consolas" w:eastAsia="Consolas" w:cs="Consolas"/>
-          <w:b w:val="0"/>
-          <w:color w:val="142232"/>
-          <w:sz w:val="18"/>
-        </w:rPr>
-        <w:t>http://127.0.0.1:18080</w:t>
+        <w:t>日常启动保留当前学习记录：</w:t>
       </w:r>
+    </w:p>
+    <w:p>
+      <w:pPr>
+        <w:pStyle w:val="ManualCode"/>
+        <w:keepLines/>
+      </w:pPr>
       <w:r>
-        <w:t>。</w:t>
+        <w:t>powershell -NoProfile -ExecutionPolicy Bypass -File .\demo\Start-Demo.ps1 -SkipBuild</w:t>
+      </w:r>
+    </w:p>
+    <w:p>
+      <w:pPr>
+        <w:pStyle w:val="Heading1"/>
+      </w:pPr>
+      <w:r>
+        <w:t>账号</w:t>
       </w:r>
     </w:p>
     <w:tbl>
@@ -847,7 +258,7 @@
                 <w:color w:val="FFFFFF"/>
                 <w:sz w:val="18"/>
               </w:rPr>
-              <w:t>现场用途</w:t>
+              <w:t>展示内容</w:t>
             </w:r>
           </w:p>
         </w:tc>
@@ -963,7 +374,7 @@
                 <w:color w:val="142232"/>
                 <w:sz w:val="18"/>
               </w:rPr>
-              <w:t>展示已有测评、画像、知识图谱、路径、任务和作业反馈</w:t>
+              <w:t>学习画像、知识图谱、路径、任务和作业反馈</w:t>
             </w:r>
           </w:p>
         </w:tc>
@@ -1083,7 +494,7 @@
                 <w:color w:val="142232"/>
                 <w:sz w:val="18"/>
               </w:rPr>
-              <w:t>从只加入课程的状态开始做初始测评</w:t>
+              <w:t>初始测评、画像和学习路径生成</w:t>
             </w:r>
           </w:p>
         </w:tc>
@@ -1199,7 +610,7 @@
                 <w:color w:val="142232"/>
                 <w:sz w:val="18"/>
               </w:rPr>
-              <w:t>展示大数据课程、题库、资源和班级</w:t>
+              <w:t>课程、题库、资源和班级</w:t>
             </w:r>
           </w:p>
         </w:tc>
@@ -1315,7 +726,617 @@
                 <w:color w:val="142232"/>
                 <w:sz w:val="18"/>
               </w:rPr>
-              <w:t>展示账号、课程和班级管理</w:t>
+              <w:t>用户、课程和班级管理</w:t>
+            </w:r>
+          </w:p>
+        </w:tc>
+      </w:tr>
+    </w:tbl>
+    <w:p>
+      <w:pPr>
+        <w:spacing w:after="40"/>
+      </w:pPr>
+    </w:p>
+    <w:p>
+      <w:pPr>
+        <w:pStyle w:val="Heading1"/>
+      </w:pPr>
+      <w:r>
+        <w:t>演示步骤</w:t>
+      </w:r>
+    </w:p>
+    <w:p>
+      <w:pPr>
+        <w:pStyle w:val="ListNumber"/>
+      </w:pPr>
+      <w:r>
+        <w:t xml:space="preserve">使用 </w:t>
+      </w:r>
+      <w:r>
+        <w:rPr>
+          <w:rFonts w:ascii="Consolas" w:hAnsi="Consolas" w:eastAsia="Consolas" w:cs="Consolas"/>
+          <w:b w:val="0"/>
+          <w:color w:val="142232"/>
+          <w:sz w:val="18"/>
+        </w:rPr>
+        <w:t>student1</w:t>
+      </w:r>
+      <w:r>
+        <w:t xml:space="preserve"> 登录，查看“大数据技术与应用”的学习进度。</w:t>
+      </w:r>
+    </w:p>
+    <w:p>
+      <w:pPr>
+        <w:pStyle w:val="ListNumber"/>
+      </w:pPr>
+      <w:r>
+        <w:t>打开“学习画像”，查看能力、掌握度和学习建议。</w:t>
+      </w:r>
+    </w:p>
+    <w:p>
+      <w:pPr>
+        <w:pStyle w:val="ListNumber"/>
+      </w:pPr>
+      <w:r>
+        <w:t>打开“知识图谱”，点击知识点查看关联内容。</w:t>
+      </w:r>
+    </w:p>
+    <w:p>
+      <w:pPr>
+        <w:pStyle w:val="ListNumber"/>
+      </w:pPr>
+      <w:r>
+        <w:t>打开“学习路径”，进入任务，查看学习资源。</w:t>
+      </w:r>
+    </w:p>
+    <w:p>
+      <w:pPr>
+        <w:pStyle w:val="ListNumber"/>
+      </w:pPr>
+      <w:r>
+        <w:t>打开“AI 助手”，搜索“Spark SQL基本操作”，提问：</w:t>
+      </w:r>
+      <w:r>
+        <w:rPr>
+          <w:rFonts w:ascii="Consolas" w:hAnsi="Consolas" w:eastAsia="Consolas" w:cs="Consolas"/>
+          <w:b w:val="0"/>
+          <w:color w:val="142232"/>
+          <w:sz w:val="18"/>
+        </w:rPr>
+        <w:t>Spark SQL 和 DataFrame 有什么关系？</w:t>
+      </w:r>
+      <w:r>
+        <w:t>。展示检索状态和正文逐步输出。</w:t>
+      </w:r>
+    </w:p>
+    <w:p>
+      <w:pPr>
+        <w:pStyle w:val="ListNumber"/>
+      </w:pPr>
+      <w:r>
+        <w:t>打开“在线作业”的已完成列表，查看反馈报告和逐题解析。</w:t>
+      </w:r>
+    </w:p>
+    <w:p>
+      <w:pPr>
+        <w:pStyle w:val="ListNumber"/>
+      </w:pPr>
+      <w:r>
+        <w:t xml:space="preserve">切换到 </w:t>
+      </w:r>
+      <w:r>
+        <w:rPr>
+          <w:rFonts w:ascii="Consolas" w:hAnsi="Consolas" w:eastAsia="Consolas" w:cs="Consolas"/>
+          <w:b w:val="0"/>
+          <w:color w:val="142232"/>
+          <w:sz w:val="18"/>
+        </w:rPr>
+        <w:t>student2</w:t>
+      </w:r>
+      <w:r>
+        <w:t>，完成知识、能力和学习习惯三项测评，查看报告、画像和学习路径。</w:t>
+      </w:r>
+    </w:p>
+    <w:p>
+      <w:pPr>
+        <w:pStyle w:val="ListNumber"/>
+      </w:pPr>
+      <w:r>
+        <w:t xml:space="preserve">切换到 </w:t>
+      </w:r>
+      <w:r>
+        <w:rPr>
+          <w:rFonts w:ascii="Consolas" w:hAnsi="Consolas" w:eastAsia="Consolas" w:cs="Consolas"/>
+          <w:b w:val="0"/>
+          <w:color w:val="142232"/>
+          <w:sz w:val="18"/>
+        </w:rPr>
+        <w:t>teacher1</w:t>
+      </w:r>
+      <w:r>
+        <w:t xml:space="preserve">，展示课程、资源、题库和班级；切换到 </w:t>
+      </w:r>
+      <w:r>
+        <w:rPr>
+          <w:rFonts w:ascii="Consolas" w:hAnsi="Consolas" w:eastAsia="Consolas" w:cs="Consolas"/>
+          <w:b w:val="0"/>
+          <w:color w:val="142232"/>
+          <w:sz w:val="18"/>
+        </w:rPr>
+        <w:t>admin</w:t>
+      </w:r>
+      <w:r>
+        <w:t>，展示用户、课程和班级管理。</w:t>
+      </w:r>
+    </w:p>
+    <w:p>
+      <w:pPr/>
+      <w:r>
+        <w:t>演示后执行恢复命令，可将两个学生恢复到起点。</w:t>
+      </w:r>
+    </w:p>
+    <w:p>
+      <w:pPr>
+        <w:pStyle w:val="Heading1"/>
+      </w:pPr>
+      <w:r>
+        <w:t>AI 与掌握度</w:t>
+      </w:r>
+    </w:p>
+    <w:p>
+      <w:pPr/>
+      <w:r>
+        <w:t xml:space="preserve">后端镜像内置 DeepSeek API 密钥，问答模型标识为 </w:t>
+      </w:r>
+      <w:r>
+        <w:rPr>
+          <w:rFonts w:ascii="Consolas" w:hAnsi="Consolas" w:eastAsia="Consolas" w:cs="Consolas"/>
+          <w:b w:val="0"/>
+          <w:color w:val="142232"/>
+          <w:sz w:val="18"/>
+        </w:rPr>
+        <w:t>deepseek-flash</w:t>
+      </w:r>
+      <w:r>
+        <w:t>。在线回答通过 WebSocket 输出。网络不可用时，固定问题使用已核对答案，其他问题使用课程内容。镜像环境变量包含密钥，交付包按账号凭据管理。</w:t>
+      </w:r>
+    </w:p>
+    <w:p>
+      <w:pPr/>
+      <w:r>
+        <w:t>当前 CPU 镜像依据历史答题记录计算掌握度，MEFKT 内容编码器未安装。</w:t>
+      </w:r>
+    </w:p>
+    <w:p>
+      <w:pPr>
+        <w:pStyle w:val="Heading1"/>
+      </w:pPr>
+      <w:r>
+        <w:t>交付文件</w:t>
+      </w:r>
+    </w:p>
+    <w:tbl>
+      <w:tblPr>
+        <w:tblW w:type="auto" w:w="0"/>
+        <w:tblLayout w:type="fixed"/>
+        <w:tblLook w:firstColumn="1" w:firstRow="1" w:lastColumn="0" w:lastRow="0" w:noHBand="0" w:noVBand="1" w:val="04A0"/>
+        <w:tblBorders>
+          <w:top w:val="single" w:sz="5" w:color="D9D9D9"/>
+          <w:left w:val="single" w:sz="5" w:color="D9D9D9"/>
+          <w:bottom w:val="single" w:sz="5" w:color="D9D9D9"/>
+          <w:right w:val="single" w:sz="5" w:color="D9D9D9"/>
+          <w:insideH w:val="single" w:sz="5" w:color="D9D9D9"/>
+          <w:insideV w:val="single" w:sz="5" w:color="D9D9D9"/>
+        </w:tblBorders>
+      </w:tblPr>
+      <w:tblGrid>
+        <w:gridCol w:w="4929"/>
+        <w:gridCol w:w="4929"/>
+      </w:tblGrid>
+      <w:tr>
+        <w:trPr>
+          <w:cantSplit/>
+          <w:tblHeader w:val="true"/>
+        </w:trPr>
+        <w:tc>
+          <w:tcPr>
+            <w:tcW w:type="dxa" w:w="2721"/>
+            <w:vAlign w:val="center"/>
+            <w:tcMar>
+              <w:top w:w="95" w:type="dxa"/>
+              <w:start w:w="105" w:type="dxa"/>
+              <w:bottom w:w="95" w:type="dxa"/>
+              <w:end w:w="105" w:type="dxa"/>
+            </w:tcMar>
+            <w:shd w:fill="18324F"/>
+          </w:tcPr>
+          <w:p>
+            <w:pPr>
+              <w:spacing w:after="0" w:line="271" w:lineRule="auto"/>
+            </w:pPr>
+            <w:r>
+              <w:rPr>
+                <w:rFonts w:ascii="Microsoft YaHei" w:hAnsi="Microsoft YaHei" w:eastAsia="Microsoft YaHei" w:cs="Microsoft YaHei"/>
+                <w:b/>
+                <w:color w:val="FFFFFF"/>
+                <w:sz w:val="18"/>
+              </w:rPr>
+              <w:t>文件</w:t>
+            </w:r>
+          </w:p>
+        </w:tc>
+        <w:tc>
+          <w:tcPr>
+            <w:tcW w:type="dxa" w:w="7087"/>
+            <w:vAlign w:val="center"/>
+            <w:tcMar>
+              <w:top w:w="95" w:type="dxa"/>
+              <w:start w:w="105" w:type="dxa"/>
+              <w:bottom w:w="95" w:type="dxa"/>
+              <w:end w:w="105" w:type="dxa"/>
+            </w:tcMar>
+            <w:shd w:fill="18324F"/>
+          </w:tcPr>
+          <w:p>
+            <w:pPr>
+              <w:spacing w:after="0" w:line="271" w:lineRule="auto"/>
+            </w:pPr>
+            <w:r>
+              <w:rPr>
+                <w:rFonts w:ascii="Microsoft YaHei" w:hAnsi="Microsoft YaHei" w:eastAsia="Microsoft YaHei" w:cs="Microsoft YaHei"/>
+                <w:b/>
+                <w:color w:val="FFFFFF"/>
+                <w:sz w:val="18"/>
+              </w:rPr>
+              <w:t>内容</w:t>
+            </w:r>
+          </w:p>
+        </w:tc>
+      </w:tr>
+      <w:tr>
+        <w:trPr>
+          <w:cantSplit/>
+        </w:trPr>
+        <w:tc>
+          <w:tcPr>
+            <w:tcW w:type="dxa" w:w="2721"/>
+            <w:vAlign w:val="center"/>
+            <w:tcMar>
+              <w:top w:w="95" w:type="dxa"/>
+              <w:start w:w="105" w:type="dxa"/>
+              <w:bottom w:w="95" w:type="dxa"/>
+              <w:end w:w="105" w:type="dxa"/>
+            </w:tcMar>
+          </w:tcPr>
+          <w:p>
+            <w:pPr>
+              <w:spacing w:after="0" w:line="278" w:lineRule="auto"/>
+            </w:pPr>
+            <w:r>
+              <w:rPr>
+                <w:rFonts w:ascii="Consolas" w:hAnsi="Consolas" w:eastAsia="Consolas" w:cs="Consolas"/>
+                <w:b w:val="0"/>
+                <w:color w:val="142232"/>
+                <w:sz w:val="18"/>
+              </w:rPr>
+              <w:t>images.tar</w:t>
+            </w:r>
+          </w:p>
+        </w:tc>
+        <w:tc>
+          <w:tcPr>
+            <w:tcW w:type="dxa" w:w="7087"/>
+            <w:vAlign w:val="center"/>
+            <w:tcMar>
+              <w:top w:w="95" w:type="dxa"/>
+              <w:start w:w="105" w:type="dxa"/>
+              <w:bottom w:w="95" w:type="dxa"/>
+              <w:end w:w="105" w:type="dxa"/>
+            </w:tcMar>
+          </w:tcPr>
+          <w:p>
+            <w:pPr>
+              <w:spacing w:after="0" w:line="278" w:lineRule="auto"/>
+            </w:pPr>
+            <w:r>
+              <w:rPr>
+                <w:rFonts w:ascii="Microsoft YaHei" w:hAnsi="Microsoft YaHei" w:eastAsia="Microsoft YaHei" w:cs="Microsoft YaHei"/>
+                <w:b w:val="0"/>
+                <w:color w:val="142232"/>
+                <w:sz w:val="18"/>
+              </w:rPr>
+              <w:t>前端、后端、PostgreSQL、Neo4j 和材料镜像</w:t>
+            </w:r>
+          </w:p>
+        </w:tc>
+      </w:tr>
+      <w:tr>
+        <w:trPr>
+          <w:cantSplit/>
+        </w:trPr>
+        <w:tc>
+          <w:tcPr>
+            <w:tcW w:type="dxa" w:w="2721"/>
+            <w:vAlign w:val="center"/>
+            <w:tcMar>
+              <w:top w:w="95" w:type="dxa"/>
+              <w:start w:w="105" w:type="dxa"/>
+              <w:bottom w:w="95" w:type="dxa"/>
+              <w:end w:w="105" w:type="dxa"/>
+            </w:tcMar>
+            <w:shd w:fill="F3F7FB"/>
+          </w:tcPr>
+          <w:p>
+            <w:pPr>
+              <w:spacing w:after="0" w:line="278" w:lineRule="auto"/>
+            </w:pPr>
+            <w:r>
+              <w:rPr>
+                <w:rFonts w:ascii="Consolas" w:hAnsi="Consolas" w:eastAsia="Consolas" w:cs="Consolas"/>
+                <w:b w:val="0"/>
+                <w:color w:val="142232"/>
+                <w:sz w:val="18"/>
+              </w:rPr>
+              <w:t>postgres-baseline.dump</w:t>
+            </w:r>
+          </w:p>
+        </w:tc>
+        <w:tc>
+          <w:tcPr>
+            <w:tcW w:type="dxa" w:w="7087"/>
+            <w:vAlign w:val="center"/>
+            <w:tcMar>
+              <w:top w:w="95" w:type="dxa"/>
+              <w:start w:w="105" w:type="dxa"/>
+              <w:bottom w:w="95" w:type="dxa"/>
+              <w:end w:w="105" w:type="dxa"/>
+            </w:tcMar>
+            <w:shd w:fill="F3F7FB"/>
+          </w:tcPr>
+          <w:p>
+            <w:pPr>
+              <w:spacing w:after="0" w:line="278" w:lineRule="auto"/>
+            </w:pPr>
+            <w:r>
+              <w:rPr>
+                <w:rFonts w:ascii="Microsoft YaHei" w:hAnsi="Microsoft YaHei" w:eastAsia="Microsoft YaHei" w:cs="Microsoft YaHei"/>
+                <w:b w:val="0"/>
+                <w:color w:val="142232"/>
+                <w:sz w:val="18"/>
+              </w:rPr>
+              <w:t>四个账号和课程学习起点</w:t>
+            </w:r>
+          </w:p>
+        </w:tc>
+      </w:tr>
+      <w:tr>
+        <w:trPr>
+          <w:cantSplit/>
+        </w:trPr>
+        <w:tc>
+          <w:tcPr>
+            <w:tcW w:type="dxa" w:w="2721"/>
+            <w:vAlign w:val="center"/>
+            <w:tcMar>
+              <w:top w:w="95" w:type="dxa"/>
+              <w:start w:w="105" w:type="dxa"/>
+              <w:bottom w:w="95" w:type="dxa"/>
+              <w:end w:w="105" w:type="dxa"/>
+            </w:tcMar>
+          </w:tcPr>
+          <w:p>
+            <w:pPr>
+              <w:spacing w:after="0" w:line="278" w:lineRule="auto"/>
+            </w:pPr>
+            <w:r>
+              <w:rPr>
+                <w:rFonts w:ascii="Consolas" w:hAnsi="Consolas" w:eastAsia="Consolas" w:cs="Consolas"/>
+                <w:b w:val="0"/>
+                <w:color w:val="142232"/>
+                <w:sz w:val="18"/>
+              </w:rPr>
+              <w:t>media-rag-baseline.tar</w:t>
+            </w:r>
+          </w:p>
+        </w:tc>
+        <w:tc>
+          <w:tcPr>
+            <w:tcW w:type="dxa" w:w="7087"/>
+            <w:vAlign w:val="center"/>
+            <w:tcMar>
+              <w:top w:w="95" w:type="dxa"/>
+              <w:start w:w="105" w:type="dxa"/>
+              <w:bottom w:w="95" w:type="dxa"/>
+              <w:end w:w="105" w:type="dxa"/>
+            </w:tcMar>
+          </w:tcPr>
+          <w:p>
+            <w:pPr>
+              <w:spacing w:after="0" w:line="278" w:lineRule="auto"/>
+            </w:pPr>
+            <w:r>
+              <w:rPr>
+                <w:rFonts w:ascii="Microsoft YaHei" w:hAnsi="Microsoft YaHei" w:eastAsia="Microsoft YaHei" w:cs="Microsoft YaHei"/>
+                <w:b w:val="0"/>
+                <w:color w:val="142232"/>
+                <w:sz w:val="18"/>
+              </w:rPr>
+              <w:t>课程文件与检索索引</w:t>
+            </w:r>
+          </w:p>
+        </w:tc>
+      </w:tr>
+      <w:tr>
+        <w:trPr>
+          <w:cantSplit/>
+        </w:trPr>
+        <w:tc>
+          <w:tcPr>
+            <w:tcW w:type="dxa" w:w="2721"/>
+            <w:vAlign w:val="center"/>
+            <w:tcMar>
+              <w:top w:w="95" w:type="dxa"/>
+              <w:start w:w="105" w:type="dxa"/>
+              <w:bottom w:w="95" w:type="dxa"/>
+              <w:end w:w="105" w:type="dxa"/>
+            </w:tcMar>
+            <w:shd w:fill="F3F7FB"/>
+          </w:tcPr>
+          <w:p>
+            <w:pPr>
+              <w:spacing w:after="0" w:line="278" w:lineRule="auto"/>
+            </w:pPr>
+            <w:r>
+              <w:rPr>
+                <w:rFonts w:ascii="Consolas" w:hAnsi="Consolas" w:eastAsia="Consolas" w:cs="Consolas"/>
+                <w:b w:val="0"/>
+                <w:color w:val="142232"/>
+                <w:sz w:val="18"/>
+              </w:rPr>
+              <w:t>manifest.json</w:t>
+            </w:r>
+          </w:p>
+        </w:tc>
+        <w:tc>
+          <w:tcPr>
+            <w:tcW w:type="dxa" w:w="7087"/>
+            <w:vAlign w:val="center"/>
+            <w:tcMar>
+              <w:top w:w="95" w:type="dxa"/>
+              <w:start w:w="105" w:type="dxa"/>
+              <w:bottom w:w="95" w:type="dxa"/>
+              <w:end w:w="105" w:type="dxa"/>
+            </w:tcMar>
+            <w:shd w:fill="F3F7FB"/>
+          </w:tcPr>
+          <w:p>
+            <w:pPr>
+              <w:spacing w:after="0" w:line="278" w:lineRule="auto"/>
+            </w:pPr>
+            <w:r>
+              <w:rPr>
+                <w:rFonts w:ascii="Microsoft YaHei" w:hAnsi="Microsoft YaHei" w:eastAsia="Microsoft YaHei" w:cs="Microsoft YaHei"/>
+                <w:b w:val="0"/>
+                <w:color w:val="142232"/>
+                <w:sz w:val="18"/>
+              </w:rPr>
+              <w:t>源码版本、镜像 ID 和归档 SHA-256</w:t>
+            </w:r>
+          </w:p>
+        </w:tc>
+      </w:tr>
+      <w:tr>
+        <w:trPr>
+          <w:cantSplit/>
+        </w:trPr>
+        <w:tc>
+          <w:tcPr>
+            <w:tcW w:type="dxa" w:w="2721"/>
+            <w:vAlign w:val="center"/>
+            <w:tcMar>
+              <w:top w:w="95" w:type="dxa"/>
+              <w:start w:w="105" w:type="dxa"/>
+              <w:bottom w:w="95" w:type="dxa"/>
+              <w:end w:w="105" w:type="dxa"/>
+            </w:tcMar>
+          </w:tcPr>
+          <w:p>
+            <w:pPr>
+              <w:spacing w:after="0" w:line="278" w:lineRule="auto"/>
+            </w:pPr>
+            <w:r>
+              <w:rPr>
+                <w:rFonts w:ascii="Consolas" w:hAnsi="Consolas" w:eastAsia="Consolas" w:cs="Consolas"/>
+                <w:b w:val="0"/>
+                <w:color w:val="142232"/>
+                <w:sz w:val="18"/>
+              </w:rPr>
+              <w:t>screenshots/</w:t>
+            </w:r>
+          </w:p>
+        </w:tc>
+        <w:tc>
+          <w:tcPr>
+            <w:tcW w:type="dxa" w:w="7087"/>
+            <w:vAlign w:val="center"/>
+            <w:tcMar>
+              <w:top w:w="95" w:type="dxa"/>
+              <w:start w:w="105" w:type="dxa"/>
+              <w:bottom w:w="95" w:type="dxa"/>
+              <w:end w:w="105" w:type="dxa"/>
+            </w:tcMar>
+          </w:tcPr>
+          <w:p>
+            <w:pPr>
+              <w:spacing w:after="0" w:line="278" w:lineRule="auto"/>
+            </w:pPr>
+            <w:r>
+              <w:rPr>
+                <w:rFonts w:ascii="Microsoft YaHei" w:hAnsi="Microsoft YaHei" w:eastAsia="Microsoft YaHei" w:cs="Microsoft YaHei"/>
+                <w:b w:val="0"/>
+                <w:color w:val="142232"/>
+                <w:sz w:val="18"/>
+              </w:rPr>
+              <w:t>本次页面截图</w:t>
+            </w:r>
+          </w:p>
+        </w:tc>
+      </w:tr>
+      <w:tr>
+        <w:trPr>
+          <w:cantSplit/>
+        </w:trPr>
+        <w:tc>
+          <w:tcPr>
+            <w:tcW w:type="dxa" w:w="2721"/>
+            <w:vAlign w:val="center"/>
+            <w:tcMar>
+              <w:top w:w="95" w:type="dxa"/>
+              <w:start w:w="105" w:type="dxa"/>
+              <w:bottom w:w="95" w:type="dxa"/>
+              <w:end w:w="105" w:type="dxa"/>
+            </w:tcMar>
+            <w:shd w:fill="F3F7FB"/>
+          </w:tcPr>
+          <w:p>
+            <w:pPr>
+              <w:spacing w:after="0" w:line="278" w:lineRule="auto"/>
+            </w:pPr>
+            <w:r>
+              <w:rPr>
+                <w:rFonts w:ascii="Consolas" w:hAnsi="Consolas" w:eastAsia="Consolas" w:cs="Consolas"/>
+                <w:b w:val="0"/>
+                <w:color w:val="142232"/>
+                <w:sz w:val="18"/>
+              </w:rPr>
+              <w:t>recordings/</w:t>
+            </w:r>
+          </w:p>
+        </w:tc>
+        <w:tc>
+          <w:tcPr>
+            <w:tcW w:type="dxa" w:w="7087"/>
+            <w:vAlign w:val="center"/>
+            <w:tcMar>
+              <w:top w:w="95" w:type="dxa"/>
+              <w:start w:w="105" w:type="dxa"/>
+              <w:bottom w:w="95" w:type="dxa"/>
+              <w:end w:w="105" w:type="dxa"/>
+            </w:tcMar>
+            <w:shd w:fill="F3F7FB"/>
+          </w:tcPr>
+          <w:p>
+            <w:pPr>
+              <w:spacing w:after="0" w:line="278" w:lineRule="auto"/>
+            </w:pPr>
+            <w:r>
+              <w:rPr>
+                <w:rFonts w:ascii="Microsoft YaHei" w:hAnsi="Microsoft YaHei" w:eastAsia="Microsoft YaHei" w:cs="Microsoft YaHei"/>
+                <w:b w:val="0"/>
+                <w:color w:val="142232"/>
+                <w:sz w:val="18"/>
+              </w:rPr>
+              <w:t>已保存的演示视频，采集版本见随附记录</w:t>
             </w:r>
           </w:p>
         </w:tc>
@@ -1329,326 +1350,7 @@
     <w:p>
       <w:pPr/>
       <w:r>
-        <w:t>以上密码只用于本机答辩包。现场录屏从登录成功后开始，不展示密码输入过程。</w:t>
-      </w:r>
-    </w:p>
-    <w:p>
-      <w:pPr>
-        <w:pStyle w:val="Heading1"/>
-      </w:pPr>
-      <w:r>
-        <w:t>建议演示顺序</w:t>
-      </w:r>
-    </w:p>
-    <w:p>
-      <w:pPr>
-        <w:pStyle w:val="ListNumber"/>
-      </w:pPr>
-      <w:r>
-        <w:t xml:space="preserve">用 </w:t>
-      </w:r>
-      <w:r>
-        <w:rPr>
-          <w:rFonts w:ascii="Consolas" w:hAnsi="Consolas" w:eastAsia="Consolas" w:cs="Consolas"/>
-          <w:b w:val="0"/>
-          <w:color w:val="142232"/>
-          <w:sz w:val="18"/>
-        </w:rPr>
-        <w:t>student1</w:t>
-      </w:r>
-      <w:r>
-        <w:t xml:space="preserve"> 登录，确认当前课程是“大数据技术与应用”。在学习中心说明已有学习进度。</w:t>
-      </w:r>
-    </w:p>
-    <w:p>
-      <w:pPr>
-        <w:pStyle w:val="ListNumber"/>
-      </w:pPr>
-      <w:r>
-        <w:t>打开“学习画像”和“知识图谱”，展示薄弱点、知识点关系和课程资料。</w:t>
-      </w:r>
-    </w:p>
-    <w:p>
-      <w:pPr>
-        <w:pStyle w:val="ListNumber"/>
-      </w:pPr>
-      <w:r>
-        <w:t>打开“学习路径”，进入一个任务，查看课程资源与任务完成入口。</w:t>
-      </w:r>
-    </w:p>
-    <w:p>
-      <w:pPr>
-        <w:pStyle w:val="ListNumber"/>
-      </w:pPr>
-      <w:r>
-        <w:t>打开“AI 助手”，搜索并选中“Spark SQL基本操作”知识点，再提问：</w:t>
-      </w:r>
-      <w:r>
-        <w:rPr>
-          <w:rFonts w:ascii="Consolas" w:hAnsi="Consolas" w:eastAsia="Consolas" w:cs="Consolas"/>
-          <w:b w:val="0"/>
-          <w:color w:val="142232"/>
-          <w:sz w:val="18"/>
-        </w:rPr>
-        <w:t>Spark SQL 和 DataFrame 有什么关系？</w:t>
-      </w:r>
-      <w:r>
-        <w:t>。再查看在线作业和已经生成的反馈报告。</w:t>
-      </w:r>
-    </w:p>
-    <w:p>
-      <w:pPr>
-        <w:pStyle w:val="ListNumber"/>
-      </w:pPr>
-      <w:r>
-        <w:t xml:space="preserve">退出并以 </w:t>
-      </w:r>
-      <w:r>
-        <w:rPr>
-          <w:rFonts w:ascii="Consolas" w:hAnsi="Consolas" w:eastAsia="Consolas" w:cs="Consolas"/>
-          <w:b w:val="0"/>
-          <w:color w:val="142232"/>
-          <w:sz w:val="18"/>
-        </w:rPr>
-        <w:t>student2</w:t>
-      </w:r>
-      <w:r>
-        <w:t xml:space="preserve"> 登录。先展示课程已加入、初始测评尚未开始，再依次完成知识测评、能力评测和习惯问卷，查看测评报告与新学习路径。</w:t>
-      </w:r>
-    </w:p>
-    <w:p>
-      <w:pPr>
-        <w:pStyle w:val="ListNumber"/>
-      </w:pPr>
-      <w:r>
-        <w:t xml:space="preserve">以 </w:t>
-      </w:r>
-      <w:r>
-        <w:rPr>
-          <w:rFonts w:ascii="Consolas" w:hAnsi="Consolas" w:eastAsia="Consolas" w:cs="Consolas"/>
-          <w:b w:val="0"/>
-          <w:color w:val="142232"/>
-          <w:sz w:val="18"/>
-        </w:rPr>
-        <w:t>teacher1</w:t>
-      </w:r>
-      <w:r>
-        <w:t xml:space="preserve"> 登录，展示大数据课程的内容、题库、资源和班级。</w:t>
-      </w:r>
-    </w:p>
-    <w:p>
-      <w:pPr>
-        <w:pStyle w:val="ListNumber"/>
-      </w:pPr>
-      <w:r>
-        <w:t xml:space="preserve">以 </w:t>
-      </w:r>
-      <w:r>
-        <w:rPr>
-          <w:rFonts w:ascii="Consolas" w:hAnsi="Consolas" w:eastAsia="Consolas" w:cs="Consolas"/>
-          <w:b w:val="0"/>
-          <w:color w:val="142232"/>
-          <w:sz w:val="18"/>
-        </w:rPr>
-        <w:t>admin</w:t>
-      </w:r>
-      <w:r>
-        <w:t xml:space="preserve"> 登录，展示系统概览、四个账号、课程和班级。</w:t>
-      </w:r>
-    </w:p>
-    <w:p>
-      <w:pPr/>
-      <w:r>
-        <w:rPr>
-          <w:rFonts w:ascii="Consolas" w:hAnsi="Consolas" w:eastAsia="Consolas" w:cs="Consolas"/>
-          <w:b w:val="0"/>
-          <w:color w:val="142232"/>
-          <w:sz w:val="18"/>
-        </w:rPr>
-        <w:t>student2</w:t>
-      </w:r>
-      <w:r>
-        <w:t xml:space="preserve"> 的知识测评包含课程初测题。答题会改变数据库状态；如果需要再次从起点演示，按下一节恢复。</w:t>
-      </w:r>
-    </w:p>
-    <w:p>
-      <w:pPr>
-        <w:pStyle w:val="Heading1"/>
-      </w:pPr>
-      <w:r>
-        <w:t>演示后恢复起点</w:t>
-      </w:r>
-    </w:p>
-    <w:p>
-      <w:pPr/>
-      <w:r>
-        <w:t>关闭正在进行的答题或页面编辑，在交付目录重新执行：</w:t>
-      </w:r>
-    </w:p>
-    <w:p>
-      <w:pPr>
-        <w:pStyle w:val="ManualCode"/>
-        <w:keepLines/>
-      </w:pPr>
-      <w:r>
-        <w:t>powershell -NoProfile -ExecutionPolicy Bypass -File .\demo\Restore-Demo.ps1 -BundleDirectory .</w:t>
-      </w:r>
-    </w:p>
-    <w:p>
-      <w:pPr>
-        <w:pStyle w:val="ManualCode"/>
-        <w:keepLines/>
-      </w:pPr>
-      <w:r>
-        <w:t>powershell -NoProfile -ExecutionPolicy Bypass -File .\demo\Verify-Demo.ps1</w:t>
-      </w:r>
-    </w:p>
-    <w:p>
-      <w:pPr/>
-      <w:r>
-        <w:t>验收输出应确认四个账号、唯一的大数据课程、课程内容非空、</w:t>
-      </w:r>
-      <w:r>
-        <w:rPr>
-          <w:rFonts w:ascii="Consolas" w:hAnsi="Consolas" w:eastAsia="Consolas" w:cs="Consolas"/>
-          <w:b w:val="0"/>
-          <w:color w:val="142232"/>
-          <w:sz w:val="18"/>
-        </w:rPr>
-        <w:t>student1</w:t>
-      </w:r>
-      <w:r>
-        <w:t xml:space="preserve"> 有学习记录且 </w:t>
-      </w:r>
-      <w:r>
-        <w:rPr>
-          <w:rFonts w:ascii="Consolas" w:hAnsi="Consolas" w:eastAsia="Consolas" w:cs="Consolas"/>
-          <w:b w:val="0"/>
-          <w:color w:val="142232"/>
-          <w:sz w:val="18"/>
-        </w:rPr>
-        <w:t>student2</w:t>
-      </w:r>
-      <w:r>
-        <w:t xml:space="preserve"> 无测评与路径记录。恢复不会改动本机其他 Compose 项目。</w:t>
-      </w:r>
-    </w:p>
-    <w:p>
-      <w:pPr>
-        <w:pStyle w:val="Heading1"/>
-      </w:pPr>
-      <w:r>
-        <w:t>AI 内容与现场网络</w:t>
-      </w:r>
-    </w:p>
-    <w:p>
-      <w:pPr/>
-      <w:r>
-        <w:t xml:space="preserve">交付前已用 DeepSeek V4.1 Flash 真实调用固定问题和学习流程，接口模型名为 </w:t>
-      </w:r>
-      <w:r>
-        <w:rPr>
-          <w:rFonts w:ascii="Consolas" w:hAnsi="Consolas" w:eastAsia="Consolas" w:cs="Consolas"/>
-          <w:b w:val="0"/>
-          <w:color w:val="142232"/>
-          <w:sz w:val="18"/>
-        </w:rPr>
-        <w:t>deepseek-flash</w:t>
-      </w:r>
-      <w:r>
-        <w:t>。网络可用时，AI 助手使用镜像内置密钥实时回答，页面显示生成状态并逐步出现正文，文字可能与录屏不同。已核对的回答按模型、调用类型和请求指纹保存，预置文件不含原始提问全文。实时请求不可用时，固定问题使用已核对的回答；其他问题依据课程知识点和资源生成内容。</w:t>
-      </w:r>
-    </w:p>
-    <w:p>
-      <w:pPr/>
-      <w:r>
-        <w:t>镜像中带有 MEFKT-NG 模型包。当前离线 CPU 环境没有内容编码器，掌握度会依据历史答题做统计计算；手册和录屏不把这一步说成已经完成了 MEFKT-NG 推理。</w:t>
-      </w:r>
-    </w:p>
-    <w:p>
-      <w:pPr>
-        <w:pStyle w:val="Heading1"/>
-      </w:pPr>
-      <w:r>
-        <w:t>截图、录屏和版本核对</w:t>
-      </w:r>
-    </w:p>
-    <w:p>
-      <w:pPr/>
-      <w:r>
-        <w:rPr>
-          <w:rFonts w:ascii="Consolas" w:hAnsi="Consolas" w:eastAsia="Consolas" w:cs="Consolas"/>
-          <w:b w:val="0"/>
-          <w:color w:val="142232"/>
-          <w:sz w:val="18"/>
-        </w:rPr>
-        <w:t>screenshots/</w:t>
-      </w:r>
-      <w:r>
-        <w:t xml:space="preserve"> 按操作顺序命名。所有正式截图、原始录屏和讲解版视频都采用 </w:t>
-      </w:r>
-      <w:r>
-        <w:rPr>
-          <w:b/>
-        </w:rPr>
-        <w:t>1920×1080</w:t>
-      </w:r>
-      <w:r>
-        <w:t>。</w:t>
-      </w:r>
-      <w:r>
-        <w:rPr>
-          <w:rFonts w:ascii="Consolas" w:hAnsi="Consolas" w:eastAsia="Consolas" w:cs="Consolas"/>
-          <w:b w:val="0"/>
-          <w:color w:val="142232"/>
-          <w:sz w:val="18"/>
-        </w:rPr>
-        <w:t>recordings/raw/</w:t>
-      </w:r>
-      <w:r>
-        <w:t xml:space="preserve"> 保存各角色的真实浏览器操作，</w:t>
-      </w:r>
-      <w:r>
-        <w:rPr>
-          <w:rFonts w:ascii="Consolas" w:hAnsi="Consolas" w:eastAsia="Consolas" w:cs="Consolas"/>
-          <w:b w:val="0"/>
-          <w:color w:val="142232"/>
-          <w:sz w:val="18"/>
-        </w:rPr>
-        <w:t>recordings/</w:t>
-      </w:r>
-      <w:r>
-        <w:t xml:space="preserve"> 中另有连贯的讲解版。</w:t>
-      </w:r>
-      <w:r>
-        <w:rPr>
-          <w:rFonts w:ascii="Consolas" w:hAnsi="Consolas" w:eastAsia="Consolas" w:cs="Consolas"/>
-          <w:b w:val="0"/>
-          <w:color w:val="142232"/>
-          <w:sz w:val="18"/>
-        </w:rPr>
-        <w:t>evidence/</w:t>
-      </w:r>
-      <w:r>
-        <w:t xml:space="preserve"> 记录截图、视频的 SHA-256、采集时运行的容器镜像 ID 和应用代码版本。</w:t>
-      </w:r>
-      <w:r>
-        <w:rPr>
-          <w:rFonts w:ascii="Consolas" w:hAnsi="Consolas" w:eastAsia="Consolas" w:cs="Consolas"/>
-          <w:b w:val="0"/>
-          <w:color w:val="142232"/>
-          <w:sz w:val="18"/>
-        </w:rPr>
-        <w:t>manifest.json</w:t>
-      </w:r>
-      <w:r>
-        <w:t xml:space="preserve"> 记录镜像与数据库归档的校验值。截图和录屏在同一版应用代码上采集；成片只剪接、配音和添加章节标题，不替换应用画面。</w:t>
-      </w:r>
-    </w:p>
-    <w:p>
-      <w:pPr/>
-      <w:r>
-        <w:t>若需要从 Docker 中重新取出这些文件，运行：</w:t>
+        <w:t>从 Docker 提取手册、截图和视频：</w:t>
       </w:r>
     </w:p>
     <w:p>
@@ -1658,95 +1360,6 @@
       </w:pPr>
       <w:r>
         <w:t>powershell -NoProfile -ExecutionPolicy Bypass -File .\demo\Extract-Artifacts.ps1</w:t>
-      </w:r>
-    </w:p>
-    <w:p>
-      <w:pPr>
-        <w:pStyle w:val="Heading1"/>
-      </w:pPr>
-      <w:r>
-        <w:t>现场快速检查</w:t>
-      </w:r>
-    </w:p>
-    <w:p>
-      <w:pPr>
-        <w:ind w:left="397" w:hanging="227"/>
-      </w:pPr>
-      <w:r>
-        <w:rPr>
-          <w:rFonts w:ascii="Microsoft YaHei" w:hAnsi="Microsoft YaHei" w:eastAsia="Microsoft YaHei" w:cs="Microsoft YaHei"/>
-          <w:b w:val="0"/>
-          <w:color w:val="142232"/>
-          <w:sz w:val="21"/>
-        </w:rPr>
-        <w:t xml:space="preserve">•  </w:t>
-      </w:r>
-      <w:r>
-        <w:rPr>
-          <w:rFonts w:ascii="Consolas" w:hAnsi="Consolas" w:eastAsia="Consolas" w:cs="Consolas"/>
-          <w:b w:val="0"/>
-          <w:color w:val="142232"/>
-          <w:sz w:val="18"/>
-        </w:rPr>
-        <w:t>docker compose -f .\demo\compose.yaml -p adaptive-edu-defense-demo ps</w:t>
-      </w:r>
-      <w:r>
-        <w:t>：四个运行服务应处于健康状态。</w:t>
-      </w:r>
-    </w:p>
-    <w:p>
-      <w:pPr>
-        <w:ind w:left="397" w:hanging="227"/>
-      </w:pPr>
-      <w:r>
-        <w:rPr>
-          <w:rFonts w:ascii="Microsoft YaHei" w:hAnsi="Microsoft YaHei" w:eastAsia="Microsoft YaHei" w:cs="Microsoft YaHei"/>
-          <w:b w:val="0"/>
-          <w:color w:val="142232"/>
-          <w:sz w:val="21"/>
-        </w:rPr>
-        <w:t xml:space="preserve">•  </w:t>
-      </w:r>
-      <w:r>
-        <w:rPr>
-          <w:rFonts w:ascii="Consolas" w:hAnsi="Consolas" w:eastAsia="Consolas" w:cs="Consolas"/>
-          <w:b w:val="0"/>
-          <w:color w:val="142232"/>
-          <w:sz w:val="18"/>
-        </w:rPr>
-        <w:t>http://127.0.0.1:18080/health/</w:t>
-      </w:r>
-      <w:r>
-        <w:t>：应返回健康响应。</w:t>
-      </w:r>
-    </w:p>
-    <w:p>
-      <w:pPr>
-        <w:ind w:left="397" w:hanging="227"/>
-      </w:pPr>
-      <w:r>
-        <w:rPr>
-          <w:rFonts w:ascii="Microsoft YaHei" w:hAnsi="Microsoft YaHei" w:eastAsia="Microsoft YaHei" w:cs="Microsoft YaHei"/>
-          <w:b w:val="0"/>
-          <w:color w:val="142232"/>
-          <w:sz w:val="21"/>
-        </w:rPr>
-        <w:t xml:space="preserve">•  </w:t>
-      </w:r>
-      <w:r>
-        <w:t xml:space="preserve">若页面版本或学生起点不对，核对 </w:t>
-      </w:r>
-      <w:r>
-        <w:rPr>
-          <w:rFonts w:ascii="Consolas" w:hAnsi="Consolas" w:eastAsia="Consolas" w:cs="Consolas"/>
-          <w:b w:val="0"/>
-          <w:color w:val="142232"/>
-          <w:sz w:val="18"/>
-        </w:rPr>
-        <w:t>manifest.json</w:t>
-      </w:r>
-      <w:r>
-        <w:t xml:space="preserve"> 后重新恢复并验收；不要公开镜像、课程资料或演示端口。</w:t>
       </w:r>
     </w:p>
     <w:sectPr>

</xml_diff>